<commit_message>
Call Generate a report with cli
</commit_message>
<xml_diff>
--- a/Professional_Vulnerability_Report.docx
+++ b/Professional_Vulnerability_Report.docx
@@ -20,12 +20,12 @@
     </w:p>
     <w:p>
       <w:r>
-        <w:t>Generated on: 2026-02-16 21:35</w:t>
+        <w:t>Generated on: 2026-02-20 19:52</w:t>
       </w:r>
     </w:p>
     <w:p>
       <w:r>
-        <w:t>Total Vulnerabilities Detected: 5</w:t>
+        <w:t>Total Vulnerabilities Detected: 7</w:t>
       </w:r>
     </w:p>
     <w:p>
@@ -43,7 +43,7 @@
     </w:p>
     <w:p>
       <w:r>
-        <w:t>A total of 5 vulnerabilities were identified across 4 files.</w:t>
+        <w:t>A total of 7 vulnerabilities were identified across 4 files.</w:t>
         <w:br/>
         <w:t>Risk distribution: Critical=0, High=0, Medium=0, Low=0.</w:t>
         <w:br/>
@@ -214,7 +214,7 @@
           </w:tcPr>
           <w:p>
             <w:r>
-              <w:t>3</w:t>
+              <w:t>5</w:t>
             </w:r>
           </w:p>
         </w:tc>
@@ -336,7 +336,7 @@
         <w:pStyle w:val="Heading3"/>
       </w:pPr>
       <w:r>
-        <w:t>A05:2025 — Injection [Unknown]</w:t>
+        <w:t>A05:2025 — Command Injection [Unknown]</w:t>
       </w:r>
     </w:p>
     <w:p>
@@ -349,7 +349,7 @@
     </w:p>
     <w:p>
       <w:r>
-        <w:t>The run_command function directly passes user-controlled input to os.system without validation, enabling OS command injection.</w:t>
+        <w:t>The run_command function directly passes user-controlled input to os.system without validation, allowing arbitrary OS command execution.</w:t>
       </w:r>
     </w:p>
     <w:p>
@@ -378,7 +378,7 @@
         <w:pStyle w:val="ListBullet"/>
       </w:pPr>
       <w:r>
-        <w:t>Step 1: Attacker supplies a crafted command string to run_command.</w:t>
+        <w:t>Step 1: Attacker supplies a malicious command string as the cmd argument.</w:t>
       </w:r>
     </w:p>
     <w:p>
@@ -386,7 +386,7 @@
         <w:pStyle w:val="ListBullet"/>
       </w:pPr>
       <w:r>
-        <w:t>Step 2: The function calls os.system with the unvalidated string.</w:t>
+        <w:t>Step 2: The function calls os.system(cmd) which executes the string in the host shell.</w:t>
       </w:r>
     </w:p>
     <w:p>
@@ -394,7 +394,7 @@
         <w:pStyle w:val="ListBullet"/>
       </w:pPr>
       <w:r>
-        <w:t>Step 3: The operating system executes the command, allowing arbitrary code execution.</w:t>
+        <w:t>Step 3: The attacker gains the ability to run arbitrary commands on the server.</w:t>
       </w:r>
     </w:p>
     <w:p>
@@ -407,7 +407,7 @@
     </w:p>
     <w:p>
       <w:r>
-        <w:t>An attacker can execute arbitrary shell commands on the host, leading to full system compromise.</w:t>
+        <w:t>Arbitrary code execution on the host system, leading to data theft, system compromise, or further lateral movement.</w:t>
       </w:r>
     </w:p>
     <w:p>
@@ -420,7 +420,7 @@
     </w:p>
     <w:p>
       <w:r>
-        <w:t>Replace os.system with subprocess.run using a list of arguments, or validate and sanitize the input before execution.</w:t>
+        <w:t>Replace os.system with subprocess.run using a list of arguments, validate or whitelist allowed commands, or remove the ability to execute arbitrary commands.</w:t>
       </w:r>
     </w:p>
     <w:p>
@@ -441,7 +441,7 @@
         <w:pStyle w:val="Heading3"/>
       </w:pPr>
       <w:r>
-        <w:t>A04:2025 — Hardcoded Secret [Unknown]</w:t>
+        <w:t>A02:2025 — Hardcoded API Key [Unknown]</w:t>
       </w:r>
     </w:p>
     <w:p>
@@ -454,7 +454,7 @@
     </w:p>
     <w:p>
       <w:r>
-        <w:t>The code contains a hardcoded API key, exposing sensitive credentials.</w:t>
+        <w:t>The code contains a hardcoded API key, which is a secret that should not be stored in source code. This exposes the key if the code is ever leaked or accessed by unauthorized parties.</w:t>
       </w:r>
     </w:p>
     <w:p>
@@ -483,7 +483,7 @@
         <w:pStyle w:val="ListBullet"/>
       </w:pPr>
       <w:r>
-        <w:t>Step 1: Attacker obtains the source code.</w:t>
+        <w:t>Step 1: Attacker gains access to the source code repository or obtains a copy of the code.</w:t>
       </w:r>
     </w:p>
     <w:p>
@@ -491,7 +491,7 @@
         <w:pStyle w:val="ListBullet"/>
       </w:pPr>
       <w:r>
-        <w:t>Step 2: Attacker extracts the hardcoded API key.</w:t>
+        <w:t>Step 2: Attacker reads the hardcoded API key from the source.</w:t>
       </w:r>
     </w:p>
     <w:p>
@@ -499,7 +499,7 @@
         <w:pStyle w:val="ListBullet"/>
       </w:pPr>
       <w:r>
-        <w:t>Step 3: Attacker uses the key to authenticate to the external service.</w:t>
+        <w:t>Step 3: Attacker uses the key to authenticate with the external service, potentially performing unauthorized actions.</w:t>
       </w:r>
     </w:p>
     <w:p>
@@ -512,7 +512,7 @@
     </w:p>
     <w:p>
       <w:r>
-        <w:t>Unauthorized access to the external service, potential data theft or abuse of the API.</w:t>
+        <w:t>Unauthorized access to the external service, leading to data theft, service abuse, or other malicious activities.</w:t>
       </w:r>
     </w:p>
     <w:p>
@@ -525,12 +525,12 @@
     </w:p>
     <w:p>
       <w:r>
-        <w:t>Store secrets in environment variables or a secrets manager and load them at runtime; avoid hardcoding credentials in source code.</w:t>
+        <w:t>Remove the hardcoded key and load it from a secure environment variable or secret manager. For example: const API_KEY = process.env.API_KEY; and ensure the environment variable is set securely.</w:t>
       </w:r>
     </w:p>
     <w:p>
       <w:r>
-        <w:t>For more info, visit: https://owasp.org/www-project-top-ten/a04:2025</w:t>
+        <w:t>For more info, visit: https://owasp.org/www-project-top-ten/a02:2025</w:t>
       </w:r>
     </w:p>
     <w:p>
@@ -643,6 +643,105 @@
         <w:pStyle w:val="Heading3"/>
       </w:pPr>
       <w:r>
+        <w:t>A05:2025 — Command Injection [Unknown]</w:t>
+      </w:r>
+    </w:p>
+    <w:p>
+      <w:r>
+        <w:rPr>
+          <w:b/>
+        </w:rPr>
+        <w:t xml:space="preserve">Description: </w:t>
+      </w:r>
+    </w:p>
+    <w:p>
+      <w:r>
+        <w:t>The run_command function directly passes user-controlled input to os.system without sanitization, allowing arbitrary OS commands to be executed.</w:t>
+      </w:r>
+    </w:p>
+    <w:p>
+      <w:r>
+        <w:rPr>
+          <w:b/>
+        </w:rPr>
+        <w:t xml:space="preserve">Evidence: </w:t>
+      </w:r>
+    </w:p>
+    <w:p>
+      <w:r>
+        <w:t>def run_command(cmd):</w:t>
+        <w:br/>
+        <w:t xml:space="preserve">    return os.system(cmd)</w:t>
+      </w:r>
+    </w:p>
+    <w:p>
+      <w:r>
+        <w:rPr>
+          <w:b/>
+        </w:rPr>
+        <w:t>Exploitation Steps:</w:t>
+      </w:r>
+    </w:p>
+    <w:p>
+      <w:pPr>
+        <w:pStyle w:val="ListBullet"/>
+      </w:pPr>
+      <w:r>
+        <w:t>Step 1: Attacker supplies a malicious command string as the cmd argument.</w:t>
+      </w:r>
+    </w:p>
+    <w:p>
+      <w:pPr>
+        <w:pStyle w:val="ListBullet"/>
+      </w:pPr>
+      <w:r>
+        <w:t>Step 2: The run_command function passes this string to os.system without validation.</w:t>
+      </w:r>
+    </w:p>
+    <w:p>
+      <w:pPr>
+        <w:pStyle w:val="ListBullet"/>
+      </w:pPr>
+      <w:r>
+        <w:t>Step 3: The operating system executes the malicious command with the privileges of the running process.</w:t>
+      </w:r>
+    </w:p>
+    <w:p>
+      <w:r>
+        <w:rPr>
+          <w:b/>
+        </w:rPr>
+        <w:t xml:space="preserve">Impact: </w:t>
+      </w:r>
+    </w:p>
+    <w:p>
+      <w:r>
+        <w:t>An attacker can execute arbitrary commands on the host, leading to full system compromise.</w:t>
+      </w:r>
+    </w:p>
+    <w:p>
+      <w:r>
+        <w:rPr>
+          <w:b/>
+        </w:rPr>
+        <w:t xml:space="preserve">Mitigation: </w:t>
+      </w:r>
+    </w:p>
+    <w:p>
+      <w:r>
+        <w:t>Use subprocess.run with a list of arguments, or validate and sanitize the input before execution.</w:t>
+      </w:r>
+    </w:p>
+    <w:p>
+      <w:r>
+        <w:t>For more info, visit: https://owasp.org/www-project-top-ten/a05:2025</w:t>
+      </w:r>
+    </w:p>
+    <w:p>
+      <w:pPr>
+        <w:pStyle w:val="Heading3"/>
+      </w:pPr>
+      <w:r>
         <w:t>A04:2025 — Hardcoded Secret [Unknown]</w:t>
       </w:r>
     </w:p>
@@ -656,7 +755,7 @@
     </w:p>
     <w:p>
       <w:r>
-        <w:t>The API key is hardcoded in the source code, exposing it to anyone who can read the code or binary.</w:t>
+        <w:t>The API_KEY constant contains a live secret key hardcoded in the source code, exposing it to anyone who can read the code.</w:t>
       </w:r>
     </w:p>
     <w:p>
@@ -685,7 +784,7 @@
         <w:pStyle w:val="ListBullet"/>
       </w:pPr>
       <w:r>
-        <w:t>Step 1: Attacker obtains the source code or binary.</w:t>
+        <w:t>Step 1: Attacker obtains the source code (e.g., via repository or code disclosure).</w:t>
       </w:r>
     </w:p>
     <w:p>
@@ -693,7 +792,7 @@
         <w:pStyle w:val="ListBullet"/>
       </w:pPr>
       <w:r>
-        <w:t>Step 2: Extracts the hardcoded API key.</w:t>
+        <w:t>Step 2: Attacker extracts the API_KEY value.</w:t>
       </w:r>
     </w:p>
     <w:p>
@@ -701,7 +800,7 @@
         <w:pStyle w:val="ListBullet"/>
       </w:pPr>
       <w:r>
-        <w:t>Step 3: Uses the key to authenticate to the external service and perform unauthorized actions.</w:t>
+        <w:t>Step 3: Attacker uses the key to authenticate to the external service, potentially performing unauthorized actions.</w:t>
       </w:r>
     </w:p>
     <w:p>
@@ -714,7 +813,7 @@
     </w:p>
     <w:p>
       <w:r>
-        <w:t>Unauthorized access to the external service, potential data exfiltration or abuse of service.</w:t>
+        <w:t>Unauthorized access to the external service, data exfiltration, or abuse of the API.</w:t>
       </w:r>
     </w:p>
     <w:p>
@@ -727,7 +826,104 @@
     </w:p>
     <w:p>
       <w:r>
-        <w:t>Store secrets in environment variables or a secrets manager and load them at runtime; remove hardcoded values from source.</w:t>
+        <w:t>Store secrets in environment variables or a secure secrets manager, and load them at runtime.</w:t>
+      </w:r>
+    </w:p>
+    <w:p>
+      <w:r>
+        <w:t>For more info, visit: https://owasp.org/www-project-top-ten/a04:2025</w:t>
+      </w:r>
+    </w:p>
+    <w:p>
+      <w:pPr>
+        <w:pStyle w:val="Heading3"/>
+      </w:pPr>
+      <w:r>
+        <w:t>A04:2025 — Hardcoded Secret [Unknown]</w:t>
+      </w:r>
+    </w:p>
+    <w:p>
+      <w:r>
+        <w:rPr>
+          <w:b/>
+        </w:rPr>
+        <w:t xml:space="preserve">Description: </w:t>
+      </w:r>
+    </w:p>
+    <w:p>
+      <w:r>
+        <w:t>The API key is hardcoded in the source code, exposing it to anyone who can read the code and allowing unauthorized use of the API.</w:t>
+      </w:r>
+    </w:p>
+    <w:p>
+      <w:r>
+        <w:rPr>
+          <w:b/>
+        </w:rPr>
+        <w:t xml:space="preserve">Evidence: </w:t>
+      </w:r>
+    </w:p>
+    <w:p>
+      <w:r>
+        <w:t>API_KEY = "sk_live_123456789"</w:t>
+      </w:r>
+    </w:p>
+    <w:p>
+      <w:r>
+        <w:rPr>
+          <w:b/>
+        </w:rPr>
+        <w:t>Exploitation Steps:</w:t>
+      </w:r>
+    </w:p>
+    <w:p>
+      <w:pPr>
+        <w:pStyle w:val="ListBullet"/>
+      </w:pPr>
+      <w:r>
+        <w:t>Step 1: Attacker obtains the source code or binary containing the hardcoded key.</w:t>
+      </w:r>
+    </w:p>
+    <w:p>
+      <w:pPr>
+        <w:pStyle w:val="ListBullet"/>
+      </w:pPr>
+      <w:r>
+        <w:t>Step 2: Attacker extracts the key "sk_live_123456789".</w:t>
+      </w:r>
+    </w:p>
+    <w:p>
+      <w:pPr>
+        <w:pStyle w:val="ListBullet"/>
+      </w:pPr>
+      <w:r>
+        <w:t>Step 3: Attacker uses the key to authenticate to the external API, gaining unauthorized access.</w:t>
+      </w:r>
+    </w:p>
+    <w:p>
+      <w:r>
+        <w:rPr>
+          <w:b/>
+        </w:rPr>
+        <w:t xml:space="preserve">Impact: </w:t>
+      </w:r>
+    </w:p>
+    <w:p>
+      <w:r>
+        <w:t>Unauthorized access to the external API, potential data exfiltration, abuse of services, and financial loss.</w:t>
+      </w:r>
+    </w:p>
+    <w:p>
+      <w:r>
+        <w:rPr>
+          <w:b/>
+        </w:rPr>
+        <w:t xml:space="preserve">Mitigation: </w:t>
+      </w:r>
+    </w:p>
+    <w:p>
+      <w:r>
+        <w:t>Store secrets in environment variables or a secure secrets manager and load them at runtime instead of hardcoding.</w:t>
       </w:r>
     </w:p>
     <w:p>
@@ -753,7 +949,7 @@
     </w:p>
     <w:p>
       <w:r>
-        <w:t>The deserialize function uses pickle.loads on untrusted data, allowing arbitrary code execution.</w:t>
+        <w:t>The deserialize function uses pickle.loads on untrusted data, allowing an attacker to execute arbitrary code during deserialization.</w:t>
       </w:r>
     </w:p>
     <w:p>
@@ -782,7 +978,7 @@
         <w:pStyle w:val="ListBullet"/>
       </w:pPr>
       <w:r>
-        <w:t>Step 1: Attacker crafts a malicious pickle payload that executes arbitrary code.</w:t>
+        <w:t>Step 1: Attacker crafts malicious pickle payload containing code to execute.</w:t>
       </w:r>
     </w:p>
     <w:p>
@@ -790,7 +986,7 @@
         <w:pStyle w:val="ListBullet"/>
       </w:pPr>
       <w:r>
-        <w:t>Step 2: Passes the payload to the deserialize function.</w:t>
+        <w:t>Step 2: Attacker supplies the payload to the deserialize function.</w:t>
       </w:r>
     </w:p>
     <w:p>
@@ -798,7 +994,7 @@
         <w:pStyle w:val="ListBullet"/>
       </w:pPr>
       <w:r>
-        <w:t>Step 3: The application executes the payload, leading to remote code execution.</w:t>
+        <w:t>Step 3: pickle.loads executes the payload, leading to arbitrary code execution.</w:t>
       </w:r>
     </w:p>
     <w:p>
@@ -811,7 +1007,7 @@
     </w:p>
     <w:p>
       <w:r>
-        <w:t>Arbitrary code execution, compromising the application and potentially the underlying system.</w:t>
+        <w:t>Arbitrary code execution on the system, leading to full compromise of the application and underlying host.</w:t>
       </w:r>
     </w:p>
     <w:p>
@@ -824,7 +1020,7 @@
     </w:p>
     <w:p>
       <w:r>
-        <w:t>Avoid using pickle for untrusted data; use safe serialization formats like JSON, or validate and restrict the objects that can be deserialized.</w:t>
+        <w:t>Avoid using pickle for untrusted data; use safe serialization formats like JSON or use pickle with a restricted set of classes via the 'pickle' module's 'Unpickler' with a custom 'find_class' method.</w:t>
       </w:r>
     </w:p>
     <w:p>

</xml_diff>